<commit_message>
#1107 - describe: function describe is broken
</commit_message>
<xml_diff>
--- a/doc/refcards/utilities-ref.docx
+++ b/doc/refcards/utilities-ref.docx
@@ -37,7 +37,7 @@
           <w:tab w:val="left" w:pos="4110" w:leader="none"/>
         </w:tabs>
         <w:suppressAutoHyphens w:val="true"/>
-        <w:overflowPunct w:val="true"/>
+        <w:overflowPunct w:val="false"/>
         <w:bidi w:val="0"/>
         <w:spacing w:before="0" w:after="0"/>
         <w:ind w:hanging="0" w:left="0" w:right="0"/>
@@ -216,34 +216,6 @@
           <w:iCs/>
           <w:sz w:val="32"/>
           <w:szCs w:val="32"/>
-          <w:u w:val="none"/>
-          <w:shd w:fill="333333" w:val="clear"/>
-        </w:rPr>
-        <w:t>            </w:t>
-      </w:r>
-      <w:r>
-        <w:rPr>
-          <w:rFonts w:ascii="Georgia" w:hAnsi="Georgia"/>
-          <w:b w:val="false"/>
-          <w:bCs/>
-          <w:i w:val="false"/>
-          <w:iCs/>
-          <w:sz w:val="32"/>
-          <w:szCs w:val="32"/>
-          <w:u w:val="none"/>
-          <w:shd w:fill="333333" w:val="clear"/>
-        </w:rPr>
-        <w:t xml:space="preserve">  </w:t>
-      </w:r>
-      <w:r>
-        <w:rPr>
-          <w:rFonts w:ascii="Georgia" w:hAnsi="Georgia"/>
-          <w:b/>
-          <w:bCs/>
-          <w:i/>
-          <w:iCs/>
-          <w:sz w:val="32"/>
-          <w:szCs w:val="32"/>
         </w:rPr>
         <w:t xml:space="preserve">  </w:t>
       </w:r>
@@ -354,7 +326,7 @@
           <w:sz w:val="16"/>
           <w:szCs w:val="16"/>
         </w:rPr>
-        <w:t>0.2.1</w:t>
+        <w:t>0.2.</w:t>
       </w:r>
       <w:r>
         <w:rPr>
@@ -366,7 +338,7 @@
           <w:sz w:val="16"/>
           <w:szCs w:val="16"/>
         </w:rPr>
-        <w:t>9</w:t>
+        <w:t>21</w:t>
       </w:r>
     </w:p>
     <w:p>
@@ -435,7 +407,22 @@
           <w:u w:val="none"/>
           <w:shd w:fill="333333" w:val="clear"/>
         </w:rPr>
-        <w:t xml:space="preserve">s   </w:t>
+        <w:t>s                                .</w:t>
+      </w:r>
+      <w:r>
+        <w:rPr>
+          <w:rFonts w:ascii="Georgia" w:hAnsi="Georgia"/>
+          <w:b/>
+          <w:bCs/>
+          <w:i/>
+          <w:iCs/>
+          <w:color w:val="FFFFFF"/>
+          <w:sz w:val="24"/>
+          <w:szCs w:val="24"/>
+          <w:u w:val="none"/>
+          <w:shd w:fill="333333" w:val="clear"/>
+        </w:rPr>
+        <w:t xml:space="preserve">   </w:t>
       </w:r>
       <w:r>
         <w:rPr>
@@ -1172,7 +1159,67 @@
           <w:u w:val="none"/>
           <w:shd w:fill="333333" w:val="clear"/>
         </w:rPr>
-        <w:t xml:space="preserve">mu-server </w:t>
+        <w:t>mu-serv</w:t>
+      </w:r>
+      <w:r>
+        <w:rPr>
+          <w:rFonts w:ascii="Georgia" w:hAnsi="Georgia"/>
+          <w:b/>
+          <w:bCs/>
+          <w:i/>
+          <w:iCs/>
+          <w:color w:val="FFFFFF"/>
+          <w:sz w:val="24"/>
+          <w:szCs w:val="24"/>
+          <w:u w:val="none"/>
+          <w:shd w:fill="333333" w:val="clear"/>
+        </w:rPr>
+        <w:t>e</w:t>
+      </w:r>
+      <w:r>
+        <w:rPr>
+          <w:rFonts w:ascii="Georgia" w:hAnsi="Georgia"/>
+          <w:b/>
+          <w:bCs/>
+          <w:i/>
+          <w:iCs/>
+          <w:color w:val="FFFFFF"/>
+          <w:sz w:val="24"/>
+          <w:szCs w:val="24"/>
+          <w:u w:val="none"/>
+          <w:shd w:fill="333333" w:val="clear"/>
+        </w:rPr>
+        <w:t xml:space="preserve">r                     </w:t>
+      </w:r>
+      <w:r>
+        <w:rPr>
+          <w:rFonts w:ascii="Georgia" w:hAnsi="Georgia"/>
+          <w:b/>
+          <w:bCs/>
+          <w:i/>
+          <w:iCs/>
+          <w:color w:val="FFFFFF"/>
+          <w:sz w:val="24"/>
+          <w:szCs w:val="24"/>
+          <w:u w:val="none"/>
+          <w:shd w:fill="333333" w:val="clear"/>
+        </w:rPr>
+        <w:t xml:space="preserve">     .</w:t>
+      </w:r>
+      <w:r>
+        <w:rPr>
+          <w:rFonts w:ascii="Georgia" w:hAnsi="Georgia"/>
+          <w:b/>
+          <w:bCs/>
+          <w:i/>
+          <w:iCs/>
+          <w:color w:val="FFFFFF"/>
+          <w:sz w:val="24"/>
+          <w:szCs w:val="24"/>
+          <w:u w:val="none"/>
+          <w:shd w:fill="333333" w:val="clear"/>
+        </w:rPr>
+        <w:t xml:space="preserve"> </w:t>
       </w:r>
       <w:r>
         <w:rPr>
@@ -1991,7 +2038,37 @@
           <w:u w:val="none"/>
           <w:shd w:fill="333333" w:val="clear"/>
         </w:rPr>
-        <w:t xml:space="preserve">mu-exec </w:t>
+        <w:t>mu-exe</w:t>
+      </w:r>
+      <w:r>
+        <w:rPr>
+          <w:rFonts w:ascii="Georgia" w:hAnsi="Georgia"/>
+          <w:b/>
+          <w:bCs/>
+          <w:i/>
+          <w:iCs/>
+          <w:color w:val="FFFFFF"/>
+          <w:sz w:val="24"/>
+          <w:szCs w:val="24"/>
+          <w:u w:val="none"/>
+          <w:shd w:fill="333333" w:val="clear"/>
+        </w:rPr>
+        <w:t>c                             .</w:t>
+      </w:r>
+      <w:r>
+        <w:rPr>
+          <w:rFonts w:ascii="Georgia" w:hAnsi="Georgia"/>
+          <w:b/>
+          <w:bCs/>
+          <w:i/>
+          <w:iCs/>
+          <w:color w:val="FFFFFF"/>
+          <w:sz w:val="24"/>
+          <w:szCs w:val="24"/>
+          <w:u w:val="none"/>
+          <w:shd w:fill="333333" w:val="clear"/>
+        </w:rPr>
+        <w:t xml:space="preserve"> </w:t>
       </w:r>
       <w:r>
         <w:rPr>
@@ -2847,7 +2924,67 @@
           <w:u w:val="none"/>
           <w:shd w:fill="333333" w:val="clear"/>
         </w:rPr>
-        <w:t xml:space="preserve">sys-dev      </w:t>
+        <w:t>sys-de</w:t>
+      </w:r>
+      <w:r>
+        <w:rPr>
+          <w:rFonts w:ascii="Georgia" w:hAnsi="Georgia"/>
+          <w:b/>
+          <w:bCs/>
+          <w:i/>
+          <w:iCs/>
+          <w:color w:val="FFFFFF"/>
+          <w:sz w:val="24"/>
+          <w:szCs w:val="24"/>
+          <w:u w:val="none"/>
+          <w:shd w:fill="333333" w:val="clear"/>
+        </w:rPr>
+        <w:t xml:space="preserve">v                          </w:t>
+      </w:r>
+      <w:r>
+        <w:rPr>
+          <w:rFonts w:ascii="Georgia" w:hAnsi="Georgia"/>
+          <w:b/>
+          <w:bCs/>
+          <w:i/>
+          <w:iCs/>
+          <w:color w:val="FFFFFF"/>
+          <w:sz w:val="24"/>
+          <w:szCs w:val="24"/>
+          <w:u w:val="none"/>
+          <w:shd w:fill="333333" w:val="clear"/>
+        </w:rPr>
+        <w:t xml:space="preserve"> .</w:t>
+      </w:r>
+      <w:r>
+        <w:rPr>
+          <w:rFonts w:ascii="Georgia" w:hAnsi="Georgia"/>
+          <w:b/>
+          <w:bCs/>
+          <w:i/>
+          <w:iCs/>
+          <w:color w:val="FFFFFF"/>
+          <w:sz w:val="24"/>
+          <w:szCs w:val="24"/>
+          <w:u w:val="none"/>
+          <w:shd w:fill="333333" w:val="clear"/>
+        </w:rPr>
+        <w:t xml:space="preserve">                   </w:t>
+      </w:r>
+      <w:r>
+        <w:rPr>
+          <w:rFonts w:ascii="Georgia" w:hAnsi="Georgia"/>
+          <w:b/>
+          <w:bCs/>
+          <w:i/>
+          <w:iCs/>
+          <w:color w:val="FFFFFF"/>
+          <w:sz w:val="24"/>
+          <w:szCs w:val="24"/>
+          <w:u w:val="none"/>
+          <w:shd w:fill="333333" w:val="clear"/>
+        </w:rPr>
+        <w:t xml:space="preserve">      </w:t>
       </w:r>
       <w:r>
         <w:rPr>
@@ -3184,7 +3321,23 @@
           <w:u w:val="none"/>
           <w:lang w:val="en-US" w:eastAsia="zh-CN" w:bidi="hi-IN"/>
         </w:rPr>
-        <w:t>: 0.0.20</w:t>
+        <w:t>: 0.0.2</w:t>
+      </w:r>
+      <w:r>
+        <w:rPr>
+          <w:rFonts w:eastAsia="Songti SC" w:cs="Arial Unicode MS" w:ascii="Andale Mono" w:hAnsi="Andale Mono"/>
+          <w:b w:val="false"/>
+          <w:bCs w:val="false"/>
+          <w:i w:val="false"/>
+          <w:iCs w:val="false"/>
+          <w:color w:val="auto"/>
+          <w:kern w:val="2"/>
+          <w:sz w:val="14"/>
+          <w:szCs w:val="14"/>
+          <w:u w:val="none"/>
+          <w:lang w:val="en-US" w:eastAsia="zh-CN" w:bidi="hi-IN"/>
+        </w:rPr>
+        <w:t>1</w:t>
       </w:r>
     </w:p>
     <w:p>
@@ -3254,7 +3407,39 @@
           <w:u w:val="none"/>
           <w:lang w:val="en-US" w:eastAsia="zh-CN" w:bidi="hi-IN"/>
         </w:rPr>
-        <w:t>Usage: mforge 0.0.20 command [option...]</w:t>
+        <w:t>Usage: mforge 0.0.2</w:t>
+      </w:r>
+      <w:r>
+        <w:rPr>
+          <w:rFonts w:eastAsia="Songti SC" w:cs="Arial Unicode MS" w:ascii="Andale Mono" w:hAnsi="Andale Mono"/>
+          <w:b w:val="false"/>
+          <w:bCs w:val="false"/>
+          <w:i w:val="false"/>
+          <w:iCs w:val="false"/>
+          <w:color w:val="auto"/>
+          <w:kern w:val="2"/>
+          <w:sz w:val="12"/>
+          <w:szCs w:val="12"/>
+          <w:u w:val="none"/>
+          <w:lang w:val="en-US" w:eastAsia="zh-CN" w:bidi="hi-IN"/>
+        </w:rPr>
+        <w:t>1</w:t>
+      </w:r>
+      <w:r>
+        <w:rPr>
+          <w:rFonts w:eastAsia="Songti SC" w:cs="Arial Unicode MS" w:ascii="Andale Mono" w:hAnsi="Andale Mono"/>
+          <w:b w:val="false"/>
+          <w:bCs w:val="false"/>
+          <w:i w:val="false"/>
+          <w:iCs w:val="false"/>
+          <w:color w:val="auto"/>
+          <w:kern w:val="2"/>
+          <w:sz w:val="12"/>
+          <w:szCs w:val="12"/>
+          <w:u w:val="none"/>
+          <w:lang w:val="en-US" w:eastAsia="zh-CN" w:bidi="hi-IN"/>
+        </w:rPr>
+        <w:t xml:space="preserve"> command [option...]</w:t>
       </w:r>
     </w:p>
     <w:p>
@@ -4137,186 +4322,6 @@
           <w:lang w:val="en-US" w:eastAsia="zh-CN" w:bidi="hi-IN"/>
         </w:rPr>
         <w:t>--recipe                           ; show recipe</w:t>
-      </w:r>
-    </w:p>
-    <w:p>
-      <w:pPr>
-        <w:pStyle w:val="Normal"/>
-        <w:ind w:hanging="0" w:left="0" w:right="0"/>
-        <w:rPr>
-          <w:rFonts w:ascii="Georgia" w:hAnsi="Georgia" w:eastAsia="Songti SC" w:cs="Arial Unicode MS"/>
-          <w:b w:val="false"/>
-          <w:bCs/>
-          <w:i w:val="false"/>
-          <w:iCs w:val="false"/>
-          <w:color w:val="auto"/>
-          <w:kern w:val="2"/>
-          <w:sz w:val="16"/>
-          <w:szCs w:val="16"/>
-          <w:u w:val="none"/>
-          <w:shd w:fill="333333" w:val="clear"/>
-          <w:lang w:val="en-US" w:eastAsia="zh-CN" w:bidi="hi-IN"/>
-        </w:rPr>
-      </w:pPr>
-      <w:r>
-        <w:rPr>
-          <w:rFonts w:eastAsia="Songti SC" w:cs="Arial Unicode MS" w:ascii="Georgia" w:hAnsi="Georgia"/>
-          <w:b w:val="false"/>
-          <w:bCs/>
-          <w:i w:val="false"/>
-          <w:iCs w:val="false"/>
-          <w:color w:val="auto"/>
-          <w:kern w:val="2"/>
-          <w:sz w:val="16"/>
-          <w:szCs w:val="16"/>
-          <w:u w:val="none"/>
-          <w:shd w:fill="333333" w:val="clear"/>
-          <w:lang w:val="en-US" w:eastAsia="zh-CN" w:bidi="hi-IN"/>
-        </w:rPr>
-      </w:r>
-    </w:p>
-    <w:p>
-      <w:pPr>
-        <w:pStyle w:val="Normal"/>
-        <w:ind w:hanging="0" w:left="0" w:right="0"/>
-        <w:rPr>
-          <w:rFonts w:ascii="Georgia" w:hAnsi="Georgia" w:eastAsia="Songti SC" w:cs="Arial Unicode MS"/>
-          <w:b w:val="false"/>
-          <w:bCs/>
-          <w:i w:val="false"/>
-          <w:iCs w:val="false"/>
-          <w:color w:val="auto"/>
-          <w:kern w:val="2"/>
-          <w:sz w:val="16"/>
-          <w:szCs w:val="16"/>
-          <w:u w:val="none"/>
-          <w:shd w:fill="333333" w:val="clear"/>
-          <w:lang w:val="en-US" w:eastAsia="zh-CN" w:bidi="hi-IN"/>
-        </w:rPr>
-      </w:pPr>
-      <w:r>
-        <w:rPr>
-          <w:rFonts w:eastAsia="Songti SC" w:cs="Arial Unicode MS" w:ascii="Georgia" w:hAnsi="Georgia"/>
-          <w:b w:val="false"/>
-          <w:bCs/>
-          <w:i w:val="false"/>
-          <w:iCs w:val="false"/>
-          <w:color w:val="auto"/>
-          <w:kern w:val="2"/>
-          <w:sz w:val="16"/>
-          <w:szCs w:val="16"/>
-          <w:u w:val="none"/>
-          <w:shd w:fill="333333" w:val="clear"/>
-          <w:lang w:val="en-US" w:eastAsia="zh-CN" w:bidi="hi-IN"/>
-        </w:rPr>
-      </w:r>
-    </w:p>
-    <w:p>
-      <w:pPr>
-        <w:pStyle w:val="Normal"/>
-        <w:ind w:hanging="0" w:left="0" w:right="0"/>
-        <w:rPr>
-          <w:rFonts w:ascii="Georgia" w:hAnsi="Georgia" w:eastAsia="Songti SC" w:cs="Arial Unicode MS"/>
-          <w:b w:val="false"/>
-          <w:bCs/>
-          <w:i w:val="false"/>
-          <w:iCs w:val="false"/>
-          <w:color w:val="auto"/>
-          <w:kern w:val="2"/>
-          <w:sz w:val="16"/>
-          <w:szCs w:val="16"/>
-          <w:u w:val="none"/>
-          <w:shd w:fill="333333" w:val="clear"/>
-          <w:lang w:val="en-US" w:eastAsia="zh-CN" w:bidi="hi-IN"/>
-        </w:rPr>
-      </w:pPr>
-      <w:r>
-        <w:rPr>
-          <w:rFonts w:eastAsia="Songti SC" w:cs="Arial Unicode MS" w:ascii="Georgia" w:hAnsi="Georgia"/>
-          <w:b w:val="false"/>
-          <w:bCs/>
-          <w:i w:val="false"/>
-          <w:iCs w:val="false"/>
-          <w:color w:val="auto"/>
-          <w:kern w:val="2"/>
-          <w:sz w:val="16"/>
-          <w:szCs w:val="16"/>
-          <w:u w:val="none"/>
-          <w:shd w:fill="333333" w:val="clear"/>
-          <w:lang w:val="en-US" w:eastAsia="zh-CN" w:bidi="hi-IN"/>
-        </w:rPr>
-      </w:r>
-    </w:p>
-    <w:p>
-      <w:pPr>
-        <w:pStyle w:val="Normal"/>
-        <w:ind w:hanging="0" w:left="0" w:right="0"/>
-        <w:rPr>
-          <w:rFonts w:ascii="Georgia" w:hAnsi="Georgia" w:eastAsia="Songti SC" w:cs="Arial Unicode MS"/>
-          <w:b w:val="false"/>
-          <w:bCs/>
-          <w:i w:val="false"/>
-          <w:iCs w:val="false"/>
-          <w:color w:val="auto"/>
-          <w:kern w:val="2"/>
-          <w:sz w:val="16"/>
-          <w:szCs w:val="16"/>
-          <w:u w:val="none"/>
-          <w:shd w:fill="333333" w:val="clear"/>
-          <w:lang w:val="en-US" w:eastAsia="zh-CN" w:bidi="hi-IN"/>
-        </w:rPr>
-      </w:pPr>
-      <w:r>
-        <w:rPr>
-          <w:rFonts w:eastAsia="Songti SC" w:cs="Arial Unicode MS" w:ascii="Georgia" w:hAnsi="Georgia"/>
-          <w:b w:val="false"/>
-          <w:bCs/>
-          <w:i w:val="false"/>
-          <w:iCs w:val="false"/>
-          <w:color w:val="auto"/>
-          <w:kern w:val="2"/>
-          <w:sz w:val="16"/>
-          <w:szCs w:val="16"/>
-          <w:u w:val="none"/>
-          <w:shd w:fill="333333" w:val="clear"/>
-          <w:lang w:val="en-US" w:eastAsia="zh-CN" w:bidi="hi-IN"/>
-        </w:rPr>
-      </w:r>
-    </w:p>
-    <w:p>
-      <w:pPr>
-        <w:pStyle w:val="Normal"/>
-        <w:ind w:hanging="0" w:left="0" w:right="0"/>
-        <w:rPr>
-          <w:rFonts w:ascii="Georgia" w:hAnsi="Georgia" w:eastAsia="Songti SC" w:cs="Arial Unicode MS"/>
-          <w:b w:val="false"/>
-          <w:bCs/>
-          <w:i w:val="false"/>
-          <w:iCs w:val="false"/>
-          <w:color w:val="auto"/>
-          <w:kern w:val="2"/>
-          <w:sz w:val="16"/>
-          <w:szCs w:val="16"/>
-          <w:u w:val="none"/>
-          <w:shd w:fill="333333" w:val="clear"/>
-          <w:lang w:val="en-US" w:eastAsia="zh-CN" w:bidi="hi-IN"/>
-        </w:rPr>
-      </w:pPr>
-      <w:r>
-        <w:rPr>
-          <w:rFonts w:eastAsia="Songti SC" w:cs="Arial Unicode MS" w:ascii="Georgia" w:hAnsi="Georgia"/>
-          <w:b w:val="false"/>
-          <w:bCs/>
-          <w:i w:val="false"/>
-          <w:iCs w:val="false"/>
-          <w:color w:val="auto"/>
-          <w:kern w:val="2"/>
-          <w:sz w:val="16"/>
-          <w:szCs w:val="16"/>
-          <w:u w:val="none"/>
-          <w:shd w:fill="333333" w:val="clear"/>
-          <w:lang w:val="en-US" w:eastAsia="zh-CN" w:bidi="hi-IN"/>
-        </w:rPr>
       </w:r>
     </w:p>
     <w:p>
@@ -5111,7 +5116,41 @@
           <w:shd w:fill="333333" w:val="clear"/>
           <w:lang w:val="en-US" w:eastAsia="zh-CN" w:bidi="hi-IN"/>
         </w:rPr>
-        <w:t xml:space="preserve">repl                                         </w:t>
+        <w:t>rep</w:t>
+      </w:r>
+      <w:r>
+        <w:rPr>
+          <w:rFonts w:eastAsia="Songti SC" w:cs="Arial Unicode MS" w:ascii="Georgia" w:hAnsi="Georgia"/>
+          <w:b/>
+          <w:bCs/>
+          <w:i/>
+          <w:iCs/>
+          <w:color w:val="FFFFFF"/>
+          <w:kern w:val="2"/>
+          <w:sz w:val="24"/>
+          <w:szCs w:val="24"/>
+          <w:u w:val="none"/>
+          <w:shd w:fill="333333" w:val="clear"/>
+          <w:lang w:val="en-US" w:eastAsia="zh-CN" w:bidi="hi-IN"/>
+        </w:rPr>
+        <w:t>l                                .</w:t>
+      </w:r>
+      <w:r>
+        <w:rPr>
+          <w:rFonts w:eastAsia="Songti SC" w:cs="Arial Unicode MS" w:ascii="Georgia" w:hAnsi="Georgia"/>
+          <w:b/>
+          <w:bCs/>
+          <w:i/>
+          <w:iCs/>
+          <w:color w:val="FFFFFF"/>
+          <w:kern w:val="2"/>
+          <w:sz w:val="24"/>
+          <w:szCs w:val="24"/>
+          <w:u w:val="none"/>
+          <w:shd w:fill="333333" w:val="clear"/>
+          <w:lang w:val="en-US" w:eastAsia="zh-CN" w:bidi="hi-IN"/>
+        </w:rPr>
+        <w:t xml:space="preserve">                                         </w:t>
       </w:r>
       <w:r>
         <w:rPr>
@@ -7941,7 +7980,7 @@
     <w:pPr>
       <w:widowControl/>
       <w:suppressAutoHyphens w:val="true"/>
-      <w:overflowPunct w:val="true"/>
+      <w:overflowPunct w:val="false"/>
       <w:bidi w:val="0"/>
       <w:spacing w:before="0" w:after="0"/>
       <w:jc w:val="left"/>
@@ -8107,8 +8146,8 @@
     </w:pPr>
     <w:rPr/>
   </w:style>
-  <w:style w:type="paragraph" w:styleId="FrameContents">
-    <w:name w:val="Frame Contents"/>
+  <w:style w:type="paragraph" w:styleId="FrameContentsuser">
+    <w:name w:val="Frame Contents (user)"/>
     <w:basedOn w:val="Normal"/>
     <w:qFormat/>
     <w:pPr/>
@@ -8125,37 +8164,37 @@
         <a:srgbClr val="000000"/>
       </a:dk1>
       <a:lt1>
-        <a:srgbClr val="ffffff"/>
+        <a:srgbClr val="FFFFFF"/>
       </a:lt1>
       <a:dk2>
         <a:srgbClr val="000000"/>
       </a:dk2>
       <a:lt2>
-        <a:srgbClr val="ffffff"/>
+        <a:srgbClr val="FFFFFF"/>
       </a:lt2>
       <a:accent1>
-        <a:srgbClr val="18a303"/>
+        <a:srgbClr val="18A303"/>
       </a:accent1>
       <a:accent2>
-        <a:srgbClr val="0369a3"/>
+        <a:srgbClr val="0369A3"/>
       </a:accent2>
       <a:accent3>
-        <a:srgbClr val="a33e03"/>
+        <a:srgbClr val="A33E03"/>
       </a:accent3>
       <a:accent4>
-        <a:srgbClr val="8e03a3"/>
+        <a:srgbClr val="8E03A3"/>
       </a:accent4>
       <a:accent5>
-        <a:srgbClr val="c99c00"/>
+        <a:srgbClr val="C99C00"/>
       </a:accent5>
       <a:accent6>
-        <a:srgbClr val="c9211e"/>
+        <a:srgbClr val="C9211E"/>
       </a:accent6>
       <a:hlink>
-        <a:srgbClr val="0000ee"/>
+        <a:srgbClr val="0000EE"/>
       </a:hlink>
       <a:folHlink>
-        <a:srgbClr val="551a8b"/>
+        <a:srgbClr val="551A8B"/>
       </a:folHlink>
     </a:clrScheme>
     <a:fontScheme name="Office">

</xml_diff>